<commit_message>
Aggiornamento del 14/10/2026 23:24
</commit_message>
<xml_diff>
--- a/manuali/manuale-utente.docx
+++ b/manuali/manuale-utente.docx
@@ -136,7 +136,7 @@
           <w:sz w:val="24"/>
           <w:szCs w:val="24"/>
         </w:rPr>
-        <w:t xml:space="preserve">Versione 3.48.0 · ottobre 2026</w:t>
+        <w:t xml:space="preserve">Versione 3.49.0 · ottobre 2026</w:t>
       </w:r>
     </w:p>
     <w:p>
@@ -3277,7 +3277,7 @@
           <w:b/>
           <w:bCs/>
         </w:rPr>
-        <w:t xml:space="preserve">3.48.0</w:t>
+        <w:t xml:space="preserve">3.49.0</w:t>
       </w:r>
       <w:r>
         <w:t xml:space="preserve"> di Scheda Botanica PRO. È diviso in cinque parti, che seguono il lavoro reale: prima si installa l’app, poi si rileva sul campo, si riconoscono le piante, si organizzano e condividono i dati e infine si regolano le impostazioni.</w:t>
@@ -20972,6 +20972,24 @@
               <w:spacing w:after="120" w:line="288"/>
             </w:pPr>
             <w:r>
+              <w:t xml:space="preserve">Nella mappa stampata il </w:t>
+            </w:r>
+            <w:r>
+              <w:rPr>
+                <w:b/>
+                <w:bCs/>
+              </w:rPr>
+              <w:t xml:space="preserve">nome dell’esemplare</w:t>
+            </w:r>
+            <w:r>
+              <w:t xml:space="preserve"> sta accanto al numero di ogni scheda; l’app sceglie da sola il lato in cui non copre altri nomi. Si toglie con la casella «Scrivi il nome dell’esemplare accanto al numero».</w:t>
+            </w:r>
+          </w:p>
+          <w:p>
+            <w:pPr>
+              <w:spacing w:after="120" w:line="288"/>
+            </w:pPr>
+            <w:r>
               <w:t xml:space="preserve">La casella </w:t>
             </w:r>
             <w:r>
@@ -33306,7 +33324,7 @@
         <w:sz w:val="16"/>
         <w:szCs w:val="16"/>
       </w:rPr>
-      <w:t xml:space="preserve">Scheda Botanica PRO 3.48.0 · Manuale utente</w:t>
+      <w:t xml:space="preserve">Scheda Botanica PRO 3.49.0 · Manuale utente</w:t>
     </w:r>
     <w:r>
       <w:tab/>
@@ -33345,7 +33363,7 @@
         <w:sz w:val="16"/>
         <w:szCs w:val="16"/>
       </w:rPr>
-      <w:t xml:space="preserve">Scheda Botanica PRO 3.48.0 · Manuale utente</w:t>
+      <w:t xml:space="preserve">Scheda Botanica PRO 3.49.0 · Manuale utente</w:t>
     </w:r>
     <w:r>
       <w:tab/>
@@ -33384,7 +33402,7 @@
         <w:sz w:val="16"/>
         <w:szCs w:val="16"/>
       </w:rPr>
-      <w:t xml:space="preserve">Scheda Botanica PRO 3.48.0 · Manuale utente</w:t>
+      <w:t xml:space="preserve">Scheda Botanica PRO 3.49.0 · Manuale utente</w:t>
     </w:r>
     <w:r>
       <w:tab/>
@@ -33423,7 +33441,7 @@
         <w:sz w:val="16"/>
         <w:szCs w:val="16"/>
       </w:rPr>
-      <w:t xml:space="preserve">Scheda Botanica PRO 3.48.0 · Manuale utente</w:t>
+      <w:t xml:space="preserve">Scheda Botanica PRO 3.49.0 · Manuale utente</w:t>
     </w:r>
     <w:r>
       <w:tab/>
@@ -33462,7 +33480,7 @@
         <w:sz w:val="16"/>
         <w:szCs w:val="16"/>
       </w:rPr>
-      <w:t xml:space="preserve">Scheda Botanica PRO 3.48.0 · Manuale utente</w:t>
+      <w:t xml:space="preserve">Scheda Botanica PRO 3.49.0 · Manuale utente</w:t>
     </w:r>
     <w:r>
       <w:tab/>

</xml_diff>

<commit_message>
Aggiornamento del 15/10/2026 20:04
</commit_message>
<xml_diff>
--- a/manuali/manuale-utente.docx
+++ b/manuali/manuale-utente.docx
@@ -136,7 +136,7 @@
           <w:sz w:val="24"/>
           <w:szCs w:val="24"/>
         </w:rPr>
-        <w:t xml:space="preserve">Versione 3.49.0 · ottobre 2026</w:t>
+        <w:t xml:space="preserve">Versione 3.50.0 · ottobre 2026</w:t>
       </w:r>
     </w:p>
     <w:p>
@@ -3277,7 +3277,7 @@
           <w:b/>
           <w:bCs/>
         </w:rPr>
-        <w:t xml:space="preserve">3.49.0</w:t>
+        <w:t xml:space="preserve">3.50.0</w:t>
       </w:r>
       <w:r>
         <w:t xml:space="preserve"> di Scheda Botanica PRO. È diviso in cinque parti, che seguono il lavoro reale: prima si installa l’app, poi si rileva sul campo, si riconoscono le piante, si organizzano e condividono i dati e infine si regolano le impostazioni.</w:t>
@@ -33324,7 +33324,7 @@
         <w:sz w:val="16"/>
         <w:szCs w:val="16"/>
       </w:rPr>
-      <w:t xml:space="preserve">Scheda Botanica PRO 3.49.0 · Manuale utente</w:t>
+      <w:t xml:space="preserve">Scheda Botanica PRO 3.50.0 · Manuale utente</w:t>
     </w:r>
     <w:r>
       <w:tab/>
@@ -33363,7 +33363,7 @@
         <w:sz w:val="16"/>
         <w:szCs w:val="16"/>
       </w:rPr>
-      <w:t xml:space="preserve">Scheda Botanica PRO 3.49.0 · Manuale utente</w:t>
+      <w:t xml:space="preserve">Scheda Botanica PRO 3.50.0 · Manuale utente</w:t>
     </w:r>
     <w:r>
       <w:tab/>
@@ -33402,7 +33402,7 @@
         <w:sz w:val="16"/>
         <w:szCs w:val="16"/>
       </w:rPr>
-      <w:t xml:space="preserve">Scheda Botanica PRO 3.49.0 · Manuale utente</w:t>
+      <w:t xml:space="preserve">Scheda Botanica PRO 3.50.0 · Manuale utente</w:t>
     </w:r>
     <w:r>
       <w:tab/>
@@ -33441,7 +33441,7 @@
         <w:sz w:val="16"/>
         <w:szCs w:val="16"/>
       </w:rPr>
-      <w:t xml:space="preserve">Scheda Botanica PRO 3.49.0 · Manuale utente</w:t>
+      <w:t xml:space="preserve">Scheda Botanica PRO 3.50.0 · Manuale utente</w:t>
     </w:r>
     <w:r>
       <w:tab/>
@@ -33480,7 +33480,7 @@
         <w:sz w:val="16"/>
         <w:szCs w:val="16"/>
       </w:rPr>
-      <w:t xml:space="preserve">Scheda Botanica PRO 3.49.0 · Manuale utente</w:t>
+      <w:t xml:space="preserve">Scheda Botanica PRO 3.50.0 · Manuale utente</w:t>
     </w:r>
     <w:r>
       <w:tab/>

</xml_diff>

<commit_message>
Aggiornamento del 15/10/2026 20:41
</commit_message>
<xml_diff>
--- a/manuali/manuale-utente.docx
+++ b/manuali/manuale-utente.docx
@@ -136,7 +136,7 @@
           <w:sz w:val="24"/>
           <w:szCs w:val="24"/>
         </w:rPr>
-        <w:t xml:space="preserve">Versione 3.50.0 · ottobre 2026</w:t>
+        <w:t xml:space="preserve">Versione 3.51.0 · ottobre 2026</w:t>
       </w:r>
     </w:p>
     <w:p>
@@ -3277,7 +3277,7 @@
           <w:b/>
           <w:bCs/>
         </w:rPr>
-        <w:t xml:space="preserve">3.50.0</w:t>
+        <w:t xml:space="preserve">3.51.0</w:t>
       </w:r>
       <w:r>
         <w:t xml:space="preserve"> di Scheda Botanica PRO. È diviso in cinque parti, che seguono il lavoro reale: prima si installa l’app, poi si rileva sul campo, si riconoscono le piante, si organizzano e condividono i dati e infine si regolano le impostazioni.</w:t>
@@ -33324,7 +33324,7 @@
         <w:sz w:val="16"/>
         <w:szCs w:val="16"/>
       </w:rPr>
-      <w:t xml:space="preserve">Scheda Botanica PRO 3.50.0 · Manuale utente</w:t>
+      <w:t xml:space="preserve">Scheda Botanica PRO 3.51.0 · Manuale utente</w:t>
     </w:r>
     <w:r>
       <w:tab/>
@@ -33363,7 +33363,7 @@
         <w:sz w:val="16"/>
         <w:szCs w:val="16"/>
       </w:rPr>
-      <w:t xml:space="preserve">Scheda Botanica PRO 3.50.0 · Manuale utente</w:t>
+      <w:t xml:space="preserve">Scheda Botanica PRO 3.51.0 · Manuale utente</w:t>
     </w:r>
     <w:r>
       <w:tab/>
@@ -33402,7 +33402,7 @@
         <w:sz w:val="16"/>
         <w:szCs w:val="16"/>
       </w:rPr>
-      <w:t xml:space="preserve">Scheda Botanica PRO 3.50.0 · Manuale utente</w:t>
+      <w:t xml:space="preserve">Scheda Botanica PRO 3.51.0 · Manuale utente</w:t>
     </w:r>
     <w:r>
       <w:tab/>
@@ -33441,7 +33441,7 @@
         <w:sz w:val="16"/>
         <w:szCs w:val="16"/>
       </w:rPr>
-      <w:t xml:space="preserve">Scheda Botanica PRO 3.50.0 · Manuale utente</w:t>
+      <w:t xml:space="preserve">Scheda Botanica PRO 3.51.0 · Manuale utente</w:t>
     </w:r>
     <w:r>
       <w:tab/>
@@ -33480,7 +33480,7 @@
         <w:sz w:val="16"/>
         <w:szCs w:val="16"/>
       </w:rPr>
-      <w:t xml:space="preserve">Scheda Botanica PRO 3.50.0 · Manuale utente</w:t>
+      <w:t xml:space="preserve">Scheda Botanica PRO 3.51.0 · Manuale utente</w:t>
     </w:r>
     <w:r>
       <w:tab/>

</xml_diff>